<commit_message>
Name the trip the flag came from, not an insulation class
The bearing rationale read "Class F alarm point", claiming a provenance
the constant does not have: the 105 °C trip is declared bare, and under
IEC 60085 105 °C is the Class A limit, Class F being 155 °C. The two
comments quoting it are updated to match; existing audit records keep
the old wording, which is correct. The appendix notes the pattern, this
being its third instance.
</commit_message>
<xml_diff>
--- a/docs/P2_Intelligent_Ecosystem_Report.docx
+++ b/docs/P2_Intelligent_Ecosystem_Report.docx
@@ -9212,6 +9212,107 @@
       </w:pPr>
       <w:r>
         <w:t xml:space="preserve">Appendix — verification commands</w:t>
+      </w:r>
+    </w:p>
+    <w:p>
+      <w:pPr>
+        <w:pStyle w:val="FirstParagraph"/>
+      </w:pPr>
+      <w:r>
+        <w:t xml:space="preserve">Every row below exists so that a claim in this report is checkable against</w:t>
+      </w:r>
+      <w:r>
+        <w:t xml:space="preserve"> </w:t>
+      </w:r>
+      <w:r>
+        <w:t xml:space="preserve">something other than the sentence making it. Running that check across artefacts</w:t>
+      </w:r>
+      <w:r>
+        <w:t xml:space="preserve"> </w:t>
+      </w:r>
+      <w:r>
+        <w:t xml:space="preserve">rather than within one found the same defect three times — a statement asserted</w:t>
+      </w:r>
+      <w:r>
+        <w:t xml:space="preserve"> </w:t>
+      </w:r>
+      <w:r>
+        <w:t xml:space="preserve">in one place that nothing else in the system supported: arrows between twins on</w:t>
+      </w:r>
+      <w:r>
+        <w:t xml:space="preserve"> </w:t>
+      </w:r>
+      <w:r>
+        <w:t xml:space="preserve">an early version of Figure 1, where no twin subscribes to another twin’s state;</w:t>
+      </w:r>
+      <w:r>
+        <w:t xml:space="preserve"> </w:t>
+      </w:r>
+      <w:r>
+        <w:t xml:space="preserve">a mechanism-accuracy figure on the executive pitch, where the trained artefact</w:t>
+      </w:r>
+      <w:r>
+        <w:t xml:space="preserve"> </w:t>
+      </w:r>
+      <w:r>
+        <w:t xml:space="preserve">holds a classifier and a regressor and no mechanism classifier at all</w:t>
+      </w:r>
+      <w:r>
+        <w:t xml:space="preserve"> </w:t>
+      </w:r>
+      <w:r>
+        <w:t xml:space="preserve">(</w:t>
+      </w:r>
+      <w:r>
+        <w:rPr>
+          <w:rStyle w:val="VerbatimChar"/>
+        </w:rPr>
+        <w:t xml:space="preserve">inference/model_loader.py:29</w:t>
+      </w:r>
+      <w:r>
+        <w:t xml:space="preserve">); and a recommendation rationale naming a</w:t>
+      </w:r>
+      <w:r>
+        <w:t xml:space="preserve"> </w:t>
+      </w:r>
+      <w:r>
+        <w:t xml:space="preserve">“</w:t>
+      </w:r>
+      <w:r>
+        <w:t xml:space="preserve">Class F alarm point</w:t>
+      </w:r>
+      <w:r>
+        <w:t xml:space="preserve">”</w:t>
+      </w:r>
+      <w:r>
+        <w:t xml:space="preserve">, where the 105 °C trip is declared bare in the simulator</w:t>
+      </w:r>
+      <w:r>
+        <w:t xml:space="preserve"> </w:t>
+      </w:r>
+      <w:r>
+        <w:t xml:space="preserve">and 105 °C is the IEC 60085 Class A limit, Class F being 155 °C</w:t>
+      </w:r>
+      <w:r>
+        <w:t xml:space="preserve"> </w:t>
+      </w:r>
+      <w:r>
+        <w:t xml:space="preserve">(</w:t>
+      </w:r>
+      <w:r>
+        <w:rPr>
+          <w:rStyle w:val="VerbatimChar"/>
+        </w:rPr>
+        <w:t xml:space="preserve">orchestrator/rules.py:17</w:t>
+      </w:r>
+      <w:r>
+        <w:t xml:space="preserve">). Each was an artefact vouching for itself, and each</w:t>
+      </w:r>
+      <w:r>
+        <w:t xml:space="preserve"> </w:t>
+      </w:r>
+      <w:r>
+        <w:t xml:space="preserve">survived until it was read against the code that would have to support it.</w:t>
       </w:r>
     </w:p>
     <w:tbl>

</xml_diff>